<commit_message>
Lock Vyborg campaign state: trans group paused, SPb keys stay in LO
User added keywords to all groups, stopped Термопанели (транз), and
kept SPb phrases in Лен. область. Memory and Word now match that —
do not re-add keys or pull SPb out of LO.

Co-authored-by: Igor-Lark <Igor-Lark@users.noreply.github.com>
</commit_message>
<xml_diff>
--- a/cursor/Klyuchi_gruppy_Termopaneli_Vyborg_2026-08-17.docx
+++ b/cursor/Klyuchi_gruppy_Termopaneli_Vyborg_2026-08-17.docx
@@ -13,7 +13,7 @@
           <w:b/>
           <w:sz w:val="36"/>
         </w:rPr>
-        <w:t>Стратегия на все РК + ключи групп Выборга</w:t>
+        <w:t>РК Выборг: факт после правок 17.08</w:t>
       </w:r>
     </w:p>
     <w:p>
@@ -27,7 +27,7 @@
           <w:b w:val="0"/>
           <w:sz w:val="22"/>
         </w:rPr>
-        <w:t>Рабочий лист. Минус-слова уже вставлены, мусорные площадки в основном убраны — не трогать.</w:t>
+        <w:t>Транз остановлена. СПб-фразы в группе ЛО оставлены. Ключи во все группы добавлены — не дублировать.</w:t>
       </w:r>
     </w:p>
     <w:p>
@@ -723,7 +723,7 @@
           <w:rFonts w:ascii="Times New Roman" w:hAnsi="Times New Roman" w:eastAsia="Times New Roman"/>
           <w:color w:val="1F4E79"/>
         </w:rPr>
-        <w:t>2. Группы РК «Термопанели в Выборге»</w:t>
+        <w:t>2. Группы РК «Термопанели в Выборге» — как есть 17.08</w:t>
       </w:r>
     </w:p>
     <w:p>
@@ -736,7 +736,7 @@
           <w:b w:val="0"/>
           <w:sz w:val="22"/>
         </w:rPr>
-        <w:t>Пять существующих групп. Новые группы не создавать. За неделю 10–16.08 фразы почти не работали: автотаргетинг съел 94% показов. Гео-группа — 0 ключей, одна конверсия как раз с неё (РСЯ, автотаргетинг).</w:t>
+        <w:t>Ключи во все группы уже добавлены. Новые группы не создавать, те же фразы не вставлять повторно.</w:t>
       </w:r>
     </w:p>
     <w:tbl>
@@ -747,16 +747,14 @@
         <w:tblLook w:firstColumn="1" w:firstRow="1" w:lastColumn="0" w:lastRow="0" w:noHBand="0" w:noVBand="1" w:val="04A0"/>
       </w:tblPr>
       <w:tblGrid>
-        <w:gridCol w:w="2018"/>
-        <w:gridCol w:w="2018"/>
-        <w:gridCol w:w="2018"/>
-        <w:gridCol w:w="2018"/>
-        <w:gridCol w:w="2018"/>
+        <w:gridCol w:w="3364"/>
+        <w:gridCol w:w="3364"/>
+        <w:gridCol w:w="3364"/>
       </w:tblGrid>
       <w:tr>
         <w:tc>
           <w:tcPr>
-            <w:tcW w:type="dxa" w:w="2018"/>
+            <w:tcW w:type="dxa" w:w="3364"/>
             <w:tcBorders>
               <w:top w:val="single" w:sz="4" w:color="666666"/>
               <w:left w:val="single" w:sz="4" w:color="666666"/>
@@ -783,7 +781,7 @@
         </w:tc>
         <w:tc>
           <w:tcPr>
-            <w:tcW w:type="dxa" w:w="2018"/>
+            <w:tcW w:type="dxa" w:w="3364"/>
             <w:tcBorders>
               <w:top w:val="single" w:sz="4" w:color="666666"/>
               <w:left w:val="single" w:sz="4" w:color="666666"/>
@@ -810,7 +808,7 @@
         </w:tc>
         <w:tc>
           <w:tcPr>
-            <w:tcW w:type="dxa" w:w="2018"/>
+            <w:tcW w:type="dxa" w:w="3364"/>
             <w:tcBorders>
               <w:top w:val="single" w:sz="4" w:color="666666"/>
               <w:left w:val="single" w:sz="4" w:color="666666"/>
@@ -831,61 +829,7 @@
                 <w:color w:val="FFFFFF"/>
                 <w:sz w:val="20"/>
               </w:rPr>
-              <w:t>Показы</w:t>
-            </w:r>
-          </w:p>
-        </w:tc>
-        <w:tc>
-          <w:tcPr>
-            <w:tcW w:type="dxa" w:w="2018"/>
-            <w:tcBorders>
-              <w:top w:val="single" w:sz="4" w:color="666666"/>
-              <w:left w:val="single" w:sz="4" w:color="666666"/>
-              <w:bottom w:val="single" w:sz="4" w:color="666666"/>
-              <w:right w:val="single" w:sz="4" w:color="666666"/>
-            </w:tcBorders>
-            <w:shd w:fill="1F4E79" w:val="clear"/>
-          </w:tcPr>
-          <w:p>
-            <w:pPr>
-              <w:spacing w:after="40" w:before="40" w:line="252" w:lineRule="auto"/>
-            </w:pPr>
-            <w:r/>
-            <w:r>
-              <w:rPr>
-                <w:rFonts w:ascii="Times New Roman" w:hAnsi="Times New Roman" w:eastAsia="Times New Roman"/>
-                <w:b/>
-                <w:color w:val="FFFFFF"/>
-                <w:sz w:val="20"/>
-              </w:rPr>
-              <w:t>Клики</w:t>
-            </w:r>
-          </w:p>
-        </w:tc>
-        <w:tc>
-          <w:tcPr>
-            <w:tcW w:type="dxa" w:w="2018"/>
-            <w:tcBorders>
-              <w:top w:val="single" w:sz="4" w:color="666666"/>
-              <w:left w:val="single" w:sz="4" w:color="666666"/>
-              <w:bottom w:val="single" w:sz="4" w:color="666666"/>
-              <w:right w:val="single" w:sz="4" w:color="666666"/>
-            </w:tcBorders>
-            <w:shd w:fill="1F4E79" w:val="clear"/>
-          </w:tcPr>
-          <w:p>
-            <w:pPr>
-              <w:spacing w:after="40" w:before="40" w:line="252" w:lineRule="auto"/>
-            </w:pPr>
-            <w:r/>
-            <w:r>
-              <w:rPr>
-                <w:rFonts w:ascii="Times New Roman" w:hAnsi="Times New Roman" w:eastAsia="Times New Roman"/>
-                <w:b/>
-                <w:color w:val="FFFFFF"/>
-                <w:sz w:val="20"/>
-              </w:rPr>
-              <w:t>Фразы сейчас</w:t>
+              <w:t>Статус 17.08</w:t>
             </w:r>
           </w:p>
         </w:tc>
@@ -893,7 +837,7 @@
       <w:tr>
         <w:tc>
           <w:tcPr>
-            <w:tcW w:type="dxa" w:w="2018"/>
+            <w:tcW w:type="dxa" w:w="3364"/>
             <w:tcBorders>
               <w:top w:val="single" w:sz="4" w:color="666666"/>
               <w:left w:val="single" w:sz="4" w:color="666666"/>
@@ -918,7 +862,7 @@
         </w:tc>
         <w:tc>
           <w:tcPr>
-            <w:tcW w:type="dxa" w:w="2018"/>
+            <w:tcW w:type="dxa" w:w="3364"/>
             <w:tcBorders>
               <w:top w:val="single" w:sz="4" w:color="666666"/>
               <w:left w:val="single" w:sz="4" w:color="666666"/>
@@ -943,7 +887,7 @@
         </w:tc>
         <w:tc>
           <w:tcPr>
-            <w:tcW w:type="dxa" w:w="2018"/>
+            <w:tcW w:type="dxa" w:w="3364"/>
             <w:tcBorders>
               <w:top w:val="single" w:sz="4" w:color="666666"/>
               <w:left w:val="single" w:sz="4" w:color="666666"/>
@@ -962,57 +906,7 @@
                 <w:b w:val="0"/>
                 <w:sz w:val="20"/>
               </w:rPr>
-              <w:t>240</w:t>
-            </w:r>
-          </w:p>
-        </w:tc>
-        <w:tc>
-          <w:tcPr>
-            <w:tcW w:type="dxa" w:w="2018"/>
-            <w:tcBorders>
-              <w:top w:val="single" w:sz="4" w:color="666666"/>
-              <w:left w:val="single" w:sz="4" w:color="666666"/>
-              <w:bottom w:val="single" w:sz="4" w:color="666666"/>
-              <w:right w:val="single" w:sz="4" w:color="666666"/>
-            </w:tcBorders>
-          </w:tcPr>
-          <w:p>
-            <w:pPr>
-              <w:spacing w:after="40" w:before="40" w:line="252" w:lineRule="auto"/>
-            </w:pPr>
-            <w:r/>
-            <w:r>
-              <w:rPr>
-                <w:rFonts w:ascii="Times New Roman" w:hAnsi="Times New Roman" w:eastAsia="Times New Roman"/>
-                <w:b w:val="0"/>
-                <w:sz w:val="20"/>
-              </w:rPr>
-              <w:t>14</w:t>
-            </w:r>
-          </w:p>
-        </w:tc>
-        <w:tc>
-          <w:tcPr>
-            <w:tcW w:type="dxa" w:w="2018"/>
-            <w:tcBorders>
-              <w:top w:val="single" w:sz="4" w:color="666666"/>
-              <w:left w:val="single" w:sz="4" w:color="666666"/>
-              <w:bottom w:val="single" w:sz="4" w:color="666666"/>
-              <w:right w:val="single" w:sz="4" w:color="666666"/>
-            </w:tcBorders>
-          </w:tcPr>
-          <w:p>
-            <w:pPr>
-              <w:spacing w:after="40" w:before="40" w:line="252" w:lineRule="auto"/>
-            </w:pPr>
-            <w:r/>
-            <w:r>
-              <w:rPr>
-                <w:rFonts w:ascii="Times New Roman" w:hAnsi="Times New Roman" w:eastAsia="Times New Roman"/>
-                <w:b w:val="0"/>
-                <w:sz w:val="20"/>
-              </w:rPr>
-              <w:t>5 фраз, 2 из них с минусами внутри</w:t>
+              <w:t>Ключи добавлены. Работает.</w:t>
             </w:r>
           </w:p>
         </w:tc>
@@ -1020,7 +914,7 @@
       <w:tr>
         <w:tc>
           <w:tcPr>
-            <w:tcW w:type="dxa" w:w="2018"/>
+            <w:tcW w:type="dxa" w:w="3364"/>
             <w:tcBorders>
               <w:top w:val="single" w:sz="4" w:color="666666"/>
               <w:left w:val="single" w:sz="4" w:color="666666"/>
@@ -1046,7 +940,7 @@
         </w:tc>
         <w:tc>
           <w:tcPr>
-            <w:tcW w:type="dxa" w:w="2018"/>
+            <w:tcW w:type="dxa" w:w="3364"/>
             <w:tcBorders>
               <w:top w:val="single" w:sz="4" w:color="666666"/>
               <w:left w:val="single" w:sz="4" w:color="666666"/>
@@ -1072,7 +966,7 @@
         </w:tc>
         <w:tc>
           <w:tcPr>
-            <w:tcW w:type="dxa" w:w="2018"/>
+            <w:tcW w:type="dxa" w:w="3364"/>
             <w:tcBorders>
               <w:top w:val="single" w:sz="4" w:color="666666"/>
               <w:left w:val="single" w:sz="4" w:color="666666"/>
@@ -1092,59 +986,7 @@
                 <w:b w:val="0"/>
                 <w:sz w:val="20"/>
               </w:rPr>
-              <w:t>200</w:t>
-            </w:r>
-          </w:p>
-        </w:tc>
-        <w:tc>
-          <w:tcPr>
-            <w:tcW w:type="dxa" w:w="2018"/>
-            <w:tcBorders>
-              <w:top w:val="single" w:sz="4" w:color="666666"/>
-              <w:left w:val="single" w:sz="4" w:color="666666"/>
-              <w:bottom w:val="single" w:sz="4" w:color="666666"/>
-              <w:right w:val="single" w:sz="4" w:color="666666"/>
-            </w:tcBorders>
-            <w:shd w:fill="F2F2F2" w:val="clear"/>
-          </w:tcPr>
-          <w:p>
-            <w:pPr>
-              <w:spacing w:after="40" w:before="40" w:line="252" w:lineRule="auto"/>
-            </w:pPr>
-            <w:r/>
-            <w:r>
-              <w:rPr>
-                <w:rFonts w:ascii="Times New Roman" w:hAnsi="Times New Roman" w:eastAsia="Times New Roman"/>
-                <w:b w:val="0"/>
-                <w:sz w:val="20"/>
-              </w:rPr>
-              <w:t>10</w:t>
-            </w:r>
-          </w:p>
-        </w:tc>
-        <w:tc>
-          <w:tcPr>
-            <w:tcW w:type="dxa" w:w="2018"/>
-            <w:tcBorders>
-              <w:top w:val="single" w:sz="4" w:color="666666"/>
-              <w:left w:val="single" w:sz="4" w:color="666666"/>
-              <w:bottom w:val="single" w:sz="4" w:color="666666"/>
-              <w:right w:val="single" w:sz="4" w:color="666666"/>
-            </w:tcBorders>
-            <w:shd w:fill="F2F2F2" w:val="clear"/>
-          </w:tcPr>
-          <w:p>
-            <w:pPr>
-              <w:spacing w:after="40" w:before="40" w:line="252" w:lineRule="auto"/>
-            </w:pPr>
-            <w:r/>
-            <w:r>
-              <w:rPr>
-                <w:rFonts w:ascii="Times New Roman" w:hAnsi="Times New Roman" w:eastAsia="Times New Roman"/>
-                <w:b w:val="0"/>
-                <w:sz w:val="20"/>
-              </w:rPr>
-              <w:t>0 фраз, только автотаргетинг</w:t>
+              <w:t>Ключи добавлены (раньше 0 фраз). Работает.</w:t>
             </w:r>
           </w:p>
         </w:tc>
@@ -1152,7 +994,7 @@
       <w:tr>
         <w:tc>
           <w:tcPr>
-            <w:tcW w:type="dxa" w:w="2018"/>
+            <w:tcW w:type="dxa" w:w="3364"/>
             <w:tcBorders>
               <w:top w:val="single" w:sz="4" w:color="666666"/>
               <w:left w:val="single" w:sz="4" w:color="666666"/>
@@ -1177,7 +1019,7 @@
         </w:tc>
         <w:tc>
           <w:tcPr>
-            <w:tcW w:type="dxa" w:w="2018"/>
+            <w:tcW w:type="dxa" w:w="3364"/>
             <w:tcBorders>
               <w:top w:val="single" w:sz="4" w:color="666666"/>
               <w:left w:val="single" w:sz="4" w:color="666666"/>
@@ -1202,7 +1044,7 @@
         </w:tc>
         <w:tc>
           <w:tcPr>
-            <w:tcW w:type="dxa" w:w="2018"/>
+            <w:tcW w:type="dxa" w:w="3364"/>
             <w:tcBorders>
               <w:top w:val="single" w:sz="4" w:color="666666"/>
               <w:left w:val="single" w:sz="4" w:color="666666"/>
@@ -1221,57 +1063,7 @@
                 <w:b w:val="0"/>
                 <w:sz w:val="20"/>
               </w:rPr>
-              <w:t>258</w:t>
-            </w:r>
-          </w:p>
-        </w:tc>
-        <w:tc>
-          <w:tcPr>
-            <w:tcW w:type="dxa" w:w="2018"/>
-            <w:tcBorders>
-              <w:top w:val="single" w:sz="4" w:color="666666"/>
-              <w:left w:val="single" w:sz="4" w:color="666666"/>
-              <w:bottom w:val="single" w:sz="4" w:color="666666"/>
-              <w:right w:val="single" w:sz="4" w:color="666666"/>
-            </w:tcBorders>
-          </w:tcPr>
-          <w:p>
-            <w:pPr>
-              <w:spacing w:after="40" w:before="40" w:line="252" w:lineRule="auto"/>
-            </w:pPr>
-            <w:r/>
-            <w:r>
-              <w:rPr>
-                <w:rFonts w:ascii="Times New Roman" w:hAnsi="Times New Roman" w:eastAsia="Times New Roman"/>
-                <w:b w:val="0"/>
-                <w:sz w:val="20"/>
-              </w:rPr>
-              <w:t>5</w:t>
-            </w:r>
-          </w:p>
-        </w:tc>
-        <w:tc>
-          <w:tcPr>
-            <w:tcW w:type="dxa" w:w="2018"/>
-            <w:tcBorders>
-              <w:top w:val="single" w:sz="4" w:color="666666"/>
-              <w:left w:val="single" w:sz="4" w:color="666666"/>
-              <w:bottom w:val="single" w:sz="4" w:color="666666"/>
-              <w:right w:val="single" w:sz="4" w:color="666666"/>
-            </w:tcBorders>
-          </w:tcPr>
-          <w:p>
-            <w:pPr>
-              <w:spacing w:after="40" w:before="40" w:line="252" w:lineRule="auto"/>
-            </w:pPr>
-            <w:r/>
-            <w:r>
-              <w:rPr>
-                <w:rFonts w:ascii="Times New Roman" w:hAnsi="Times New Roman" w:eastAsia="Times New Roman"/>
-                <w:b w:val="0"/>
-                <w:sz w:val="20"/>
-              </w:rPr>
-              <w:t>1 фраза</w:t>
+              <w:t>Ключи добавлены. Работает.</w:t>
             </w:r>
           </w:p>
         </w:tc>
@@ -1279,7 +1071,7 @@
       <w:tr>
         <w:tc>
           <w:tcPr>
-            <w:tcW w:type="dxa" w:w="2018"/>
+            <w:tcW w:type="dxa" w:w="3364"/>
             <w:tcBorders>
               <w:top w:val="single" w:sz="4" w:color="666666"/>
               <w:left w:val="single" w:sz="4" w:color="666666"/>
@@ -1305,7 +1097,7 @@
         </w:tc>
         <w:tc>
           <w:tcPr>
-            <w:tcW w:type="dxa" w:w="2018"/>
+            <w:tcW w:type="dxa" w:w="3364"/>
             <w:tcBorders>
               <w:top w:val="single" w:sz="4" w:color="666666"/>
               <w:left w:val="single" w:sz="4" w:color="666666"/>
@@ -1331,7 +1123,7 @@
         </w:tc>
         <w:tc>
           <w:tcPr>
-            <w:tcW w:type="dxa" w:w="2018"/>
+            <w:tcW w:type="dxa" w:w="3364"/>
             <w:tcBorders>
               <w:top w:val="single" w:sz="4" w:color="666666"/>
               <w:left w:val="single" w:sz="4" w:color="666666"/>
@@ -1351,59 +1143,7 @@
                 <w:b w:val="0"/>
                 <w:sz w:val="20"/>
               </w:rPr>
-              <w:t>453</w:t>
-            </w:r>
-          </w:p>
-        </w:tc>
-        <w:tc>
-          <w:tcPr>
-            <w:tcW w:type="dxa" w:w="2018"/>
-            <w:tcBorders>
-              <w:top w:val="single" w:sz="4" w:color="666666"/>
-              <w:left w:val="single" w:sz="4" w:color="666666"/>
-              <w:bottom w:val="single" w:sz="4" w:color="666666"/>
-              <w:right w:val="single" w:sz="4" w:color="666666"/>
-            </w:tcBorders>
-            <w:shd w:fill="F2F2F2" w:val="clear"/>
-          </w:tcPr>
-          <w:p>
-            <w:pPr>
-              <w:spacing w:after="40" w:before="40" w:line="252" w:lineRule="auto"/>
-            </w:pPr>
-            <w:r/>
-            <w:r>
-              <w:rPr>
-                <w:rFonts w:ascii="Times New Roman" w:hAnsi="Times New Roman" w:eastAsia="Times New Roman"/>
-                <w:b w:val="0"/>
-                <w:sz w:val="20"/>
-              </w:rPr>
-              <w:t>8</w:t>
-            </w:r>
-          </w:p>
-        </w:tc>
-        <w:tc>
-          <w:tcPr>
-            <w:tcW w:type="dxa" w:w="2018"/>
-            <w:tcBorders>
-              <w:top w:val="single" w:sz="4" w:color="666666"/>
-              <w:left w:val="single" w:sz="4" w:color="666666"/>
-              <w:bottom w:val="single" w:sz="4" w:color="666666"/>
-              <w:right w:val="single" w:sz="4" w:color="666666"/>
-            </w:tcBorders>
-            <w:shd w:fill="F2F2F2" w:val="clear"/>
-          </w:tcPr>
-          <w:p>
-            <w:pPr>
-              <w:spacing w:after="40" w:before="40" w:line="252" w:lineRule="auto"/>
-            </w:pPr>
-            <w:r/>
-            <w:r>
-              <w:rPr>
-                <w:rFonts w:ascii="Times New Roman" w:hAnsi="Times New Roman" w:eastAsia="Times New Roman"/>
-                <w:b w:val="0"/>
-                <w:sz w:val="20"/>
-              </w:rPr>
-              <w:t>4 фразы, уклон в СПб</w:t>
+              <w:t>ОСТАНОВЛЕНА. Не включать.</w:t>
             </w:r>
           </w:p>
         </w:tc>
@@ -1411,7 +1151,7 @@
       <w:tr>
         <w:tc>
           <w:tcPr>
-            <w:tcW w:type="dxa" w:w="2018"/>
+            <w:tcW w:type="dxa" w:w="3364"/>
             <w:tcBorders>
               <w:top w:val="single" w:sz="4" w:color="666666"/>
               <w:left w:val="single" w:sz="4" w:color="666666"/>
@@ -1436,7 +1176,7 @@
         </w:tc>
         <w:tc>
           <w:tcPr>
-            <w:tcW w:type="dxa" w:w="2018"/>
+            <w:tcW w:type="dxa" w:w="3364"/>
             <w:tcBorders>
               <w:top w:val="single" w:sz="4" w:color="666666"/>
               <w:left w:val="single" w:sz="4" w:color="666666"/>
@@ -1461,7 +1201,7 @@
         </w:tc>
         <w:tc>
           <w:tcPr>
-            <w:tcW w:type="dxa" w:w="2018"/>
+            <w:tcW w:type="dxa" w:w="3364"/>
             <w:tcBorders>
               <w:top w:val="single" w:sz="4" w:color="666666"/>
               <w:left w:val="single" w:sz="4" w:color="666666"/>
@@ -1480,57 +1220,7 @@
                 <w:b w:val="0"/>
                 <w:sz w:val="20"/>
               </w:rPr>
-              <w:t>231</w:t>
-            </w:r>
-          </w:p>
-        </w:tc>
-        <w:tc>
-          <w:tcPr>
-            <w:tcW w:type="dxa" w:w="2018"/>
-            <w:tcBorders>
-              <w:top w:val="single" w:sz="4" w:color="666666"/>
-              <w:left w:val="single" w:sz="4" w:color="666666"/>
-              <w:bottom w:val="single" w:sz="4" w:color="666666"/>
-              <w:right w:val="single" w:sz="4" w:color="666666"/>
-            </w:tcBorders>
-          </w:tcPr>
-          <w:p>
-            <w:pPr>
-              <w:spacing w:after="40" w:before="40" w:line="252" w:lineRule="auto"/>
-            </w:pPr>
-            <w:r/>
-            <w:r>
-              <w:rPr>
-                <w:rFonts w:ascii="Times New Roman" w:hAnsi="Times New Roman" w:eastAsia="Times New Roman"/>
-                <w:b w:val="0"/>
-                <w:sz w:val="20"/>
-              </w:rPr>
-              <w:t>5</w:t>
-            </w:r>
-          </w:p>
-        </w:tc>
-        <w:tc>
-          <w:tcPr>
-            <w:tcW w:type="dxa" w:w="2018"/>
-            <w:tcBorders>
-              <w:top w:val="single" w:sz="4" w:color="666666"/>
-              <w:left w:val="single" w:sz="4" w:color="666666"/>
-              <w:bottom w:val="single" w:sz="4" w:color="666666"/>
-              <w:right w:val="single" w:sz="4" w:color="666666"/>
-            </w:tcBorders>
-          </w:tcPr>
-          <w:p>
-            <w:pPr>
-              <w:spacing w:after="40" w:before="40" w:line="252" w:lineRule="auto"/>
-            </w:pPr>
-            <w:r/>
-            <w:r>
-              <w:rPr>
-                <w:rFonts w:ascii="Times New Roman" w:hAnsi="Times New Roman" w:eastAsia="Times New Roman"/>
-                <w:b w:val="0"/>
-                <w:sz w:val="20"/>
-              </w:rPr>
-              <w:t>2 фразы, обе про СПб — не ЛО</w:t>
+              <w:t>Работает. Фразы по СПб оставлены — так и надо.</w:t>
             </w:r>
           </w:p>
         </w:tc>
@@ -1540,6 +1230,32 @@
       <w:pPr>
         <w:spacing w:after="120"/>
       </w:pPr>
+    </w:p>
+    <w:p>
+      <w:pPr>
+        <w:spacing w:after="160" w:before="0" w:line="269" w:lineRule="auto"/>
+      </w:pPr>
+      <w:r>
+        <w:rPr>
+          <w:rFonts w:ascii="Times New Roman" w:hAnsi="Times New Roman" w:eastAsia="Times New Roman"/>
+          <w:b w:val="0"/>
+          <w:sz w:val="22"/>
+        </w:rPr>
+        <w:t>Почему СПб в ЛО не трогать: транз на паузе, иначе запросы «термопанели спб» негде крутиться. Пока транз стоит — спб-фразы живут только в группе ЛО. Включать транз обратно нельзя, пока эти фразы не убраны из ЛО (две группы начнут биться за один аукцион).</w:t>
+      </w:r>
+    </w:p>
+    <w:p>
+      <w:pPr>
+        <w:spacing w:after="160" w:before="0" w:line="269" w:lineRule="auto"/>
+      </w:pPr>
+      <w:r>
+        <w:rPr>
+          <w:rFonts w:ascii="Times New Roman" w:hAnsi="Times New Roman" w:eastAsia="Times New Roman"/>
+          <w:b w:val="0"/>
+          <w:sz w:val="22"/>
+        </w:rPr>
+        <w:t>Объявления группы ЛО лучше с формулировкой «СПб и Ленобласть / доставка», а не только «по области» — иначе клики из СПб по старым спб-фразам будут слабее.</w:t>
+      </w:r>
     </w:p>
     <w:p>
       <w:pPr>
@@ -1562,22 +1278,9 @@
         <w:rPr>
           <w:rFonts w:ascii="Times New Roman" w:hAnsi="Times New Roman" w:eastAsia="Times New Roman"/>
           <w:b w:val="0"/>
-          <w:sz w:val="20"/>
-        </w:rPr>
-        <w:t>Смысл: купить / цена / расчёт. Без городов (города — в группах 2, транз, ЛО).</w:t>
-      </w:r>
-    </w:p>
-    <w:p>
-      <w:pPr>
-        <w:spacing w:after="40" w:before="0" w:line="269" w:lineRule="auto"/>
-      </w:pPr>
-      <w:r>
-        <w:rPr>
-          <w:rFonts w:ascii="Times New Roman" w:hAnsi="Times New Roman" w:eastAsia="Times New Roman"/>
-          <w:b/>
           <w:sz w:val="22"/>
         </w:rPr>
-        <w:t>Сейчас в группе</w:t>
+        <w:t>Ключи добавлены 17.08. Не вставлять повторно. Смысл: купить / цена / расчёт, без городов.</w:t>
       </w:r>
     </w:p>
     <w:p>
@@ -1589,9 +1292,9 @@
         <w:rPr>
           <w:rFonts w:ascii="Times New Roman" w:hAnsi="Times New Roman" w:eastAsia="Times New Roman"/>
           <w:b w:val="0"/>
-          <w:sz w:val="20"/>
+          <w:sz w:val="22"/>
         </w:rPr>
-        <w:t>купить клинкерные термопанели — 2 показа, оставить</w:t>
+        <w:t>Если ещё крутятся старые фразы с минусами внутри ключа (−цена −купить −дом) — выключить.</w:t>
       </w:r>
     </w:p>
     <w:p>
@@ -1603,211 +1306,9 @@
         <w:rPr>
           <w:rFonts w:ascii="Times New Roman" w:hAnsi="Times New Roman" w:eastAsia="Times New Roman"/>
           <w:b w:val="0"/>
-          <w:sz w:val="20"/>
-        </w:rPr>
-        <w:t>купить термопанели для дома — 1 показ, оставить</w:t>
-      </w:r>
-    </w:p>
-    <w:p>
-      <w:pPr>
-        <w:pStyle w:val="ListBullet"/>
-        <w:spacing w:after="40" w:line="259" w:lineRule="auto"/>
-      </w:pPr>
-      <w:r>
-        <w:rPr>
-          <w:rFonts w:ascii="Times New Roman" w:hAnsi="Times New Roman" w:eastAsia="Times New Roman"/>
-          <w:b w:val="0"/>
-          <w:sz w:val="20"/>
-        </w:rPr>
-        <w:t>термопанели -цена -производитель -купить -заказывать -доставка — 57 показов: минусы внутри ключа режут коммерцию</w:t>
-      </w:r>
-    </w:p>
-    <w:p>
-      <w:pPr>
-        <w:pStyle w:val="ListBullet"/>
-        <w:spacing w:after="40" w:line="259" w:lineRule="auto"/>
-      </w:pPr>
-      <w:r>
-        <w:rPr>
-          <w:rFonts w:ascii="Times New Roman" w:hAnsi="Times New Roman" w:eastAsia="Times New Roman"/>
-          <w:b w:val="0"/>
-          <w:sz w:val="20"/>
-        </w:rPr>
-        <w:t>фасадные термопанели цена -дом -кирпич — минус «дом» убивает целевой запрос</w:t>
-      </w:r>
-    </w:p>
-    <w:p>
-      <w:pPr>
-        <w:pStyle w:val="ListBullet"/>
-        <w:spacing w:after="40" w:line="259" w:lineRule="auto"/>
-      </w:pPr>
-      <w:r>
-        <w:rPr>
-          <w:rFonts w:ascii="Times New Roman" w:hAnsi="Times New Roman" w:eastAsia="Times New Roman"/>
-          <w:b w:val="0"/>
-          <w:sz w:val="20"/>
-        </w:rPr>
-        <w:t>фасадные панели для наружной отделки — широко, без «термо»</w:t>
-      </w:r>
-    </w:p>
-    <w:p>
-      <w:pPr>
-        <w:pStyle w:val="ListBullet"/>
-        <w:spacing w:after="40" w:line="259" w:lineRule="auto"/>
-      </w:pPr>
-      <w:r>
-        <w:rPr>
-          <w:rFonts w:ascii="Times New Roman" w:hAnsi="Times New Roman" w:eastAsia="Times New Roman"/>
-          <w:b w:val="0"/>
-          <w:sz w:val="20"/>
-        </w:rPr>
-        <w:t>автотаргетинг — 173 показа / 11 кликов</w:t>
-      </w:r>
-    </w:p>
-    <w:p>
-      <w:pPr>
-        <w:spacing w:after="40" w:before="80" w:line="269" w:lineRule="auto"/>
-      </w:pPr>
-      <w:r>
-        <w:rPr>
-          <w:rFonts w:ascii="Times New Roman" w:hAnsi="Times New Roman" w:eastAsia="Times New Roman"/>
-          <w:b/>
           <w:sz w:val="22"/>
         </w:rPr>
-        <w:t>УДАЛИТЬ</w:t>
-      </w:r>
-    </w:p>
-    <w:p>
-      <w:pPr>
-        <w:pStyle w:val="ListBullet"/>
-        <w:spacing w:after="40" w:line="259" w:lineRule="auto"/>
-      </w:pPr>
-      <w:r>
-        <w:rPr>
-          <w:rFonts w:ascii="Times New Roman" w:hAnsi="Times New Roman" w:eastAsia="Times New Roman"/>
-          <w:b w:val="0"/>
-          <w:sz w:val="20"/>
-        </w:rPr>
-        <w:t>термопанели -цена -производитель -купить -заказывать -доставка</w:t>
-      </w:r>
-    </w:p>
-    <w:p>
-      <w:pPr>
-        <w:pStyle w:val="ListBullet"/>
-        <w:spacing w:after="40" w:line="259" w:lineRule="auto"/>
-      </w:pPr>
-      <w:r>
-        <w:rPr>
-          <w:rFonts w:ascii="Times New Roman" w:hAnsi="Times New Roman" w:eastAsia="Times New Roman"/>
-          <w:b w:val="0"/>
-          <w:sz w:val="20"/>
-        </w:rPr>
-        <w:t>фасадные термопанели цена -дом -кирпич</w:t>
-      </w:r>
-    </w:p>
-    <w:p>
-      <w:pPr>
-        <w:pStyle w:val="ListBullet"/>
-        <w:spacing w:after="40" w:line="259" w:lineRule="auto"/>
-      </w:pPr>
-      <w:r>
-        <w:rPr>
-          <w:rFonts w:ascii="Times New Roman" w:hAnsi="Times New Roman" w:eastAsia="Times New Roman"/>
-          <w:b w:val="0"/>
-          <w:sz w:val="20"/>
-        </w:rPr>
-        <w:t>фасадные панели для наружной отделки</w:t>
-      </w:r>
-    </w:p>
-    <w:p>
-      <w:pPr>
-        <w:spacing w:after="40" w:before="80" w:line="269" w:lineRule="auto"/>
-      </w:pPr>
-      <w:r>
-        <w:rPr>
-          <w:rFonts w:ascii="Times New Roman" w:hAnsi="Times New Roman" w:eastAsia="Times New Roman"/>
-          <w:b/>
-          <w:sz w:val="22"/>
-        </w:rPr>
-        <w:t>ОСТАВИТЬ</w:t>
-      </w:r>
-    </w:p>
-    <w:p>
-      <w:pPr>
-        <w:pStyle w:val="ListBullet"/>
-        <w:spacing w:after="40" w:line="259" w:lineRule="auto"/>
-      </w:pPr>
-      <w:r>
-        <w:rPr>
-          <w:rFonts w:ascii="Times New Roman" w:hAnsi="Times New Roman" w:eastAsia="Times New Roman"/>
-          <w:b w:val="0"/>
-          <w:sz w:val="20"/>
-        </w:rPr>
-        <w:t>купить клинкерные термопанели</w:t>
-      </w:r>
-    </w:p>
-    <w:p>
-      <w:pPr>
-        <w:pStyle w:val="ListBullet"/>
-        <w:spacing w:after="40" w:line="259" w:lineRule="auto"/>
-      </w:pPr>
-      <w:r>
-        <w:rPr>
-          <w:rFonts w:ascii="Times New Roman" w:hAnsi="Times New Roman" w:eastAsia="Times New Roman"/>
-          <w:b w:val="0"/>
-          <w:sz w:val="20"/>
-        </w:rPr>
-        <w:t>купить термопанели для дома</w:t>
-      </w:r>
-    </w:p>
-    <w:p>
-      <w:pPr>
-        <w:spacing w:after="60" w:before="80" w:line="269" w:lineRule="auto"/>
-      </w:pPr>
-      <w:r>
-        <w:rPr>
-          <w:rFonts w:ascii="Times New Roman" w:hAnsi="Times New Roman" w:eastAsia="Times New Roman"/>
-          <w:b/>
-          <w:sz w:val="22"/>
-        </w:rPr>
-        <w:t>ДОБАВИТЬ — вставить списком, тип соответствия «фраза»</w:t>
-      </w:r>
-    </w:p>
-    <w:p>
-      <w:pPr>
-        <w:spacing w:after="160" w:line="276" w:lineRule="auto"/>
-        <w:ind w:left="170"/>
-        <w:shd w:fill="F4F7FB" w:val="clear"/>
-      </w:pPr>
-      <w:r>
-        <w:rPr>
-          <w:rFonts w:ascii="Times New Roman" w:hAnsi="Times New Roman" w:eastAsia="Times New Roman"/>
-          <w:b w:val="0"/>
-          <w:sz w:val="20"/>
-        </w:rPr>
-        <w:t>купить термопанели</w:t>
-        <w:br/>
-        <w:t>термопанели купить</w:t>
-        <w:br/>
-        <w:t>термопанели цена</w:t>
-        <w:br/>
-        <w:t>термопанели цена за м2</w:t>
-        <w:br/>
-        <w:t>фасадные термопанели купить</w:t>
-        <w:br/>
-        <w:t>купить фасадные термопанели</w:t>
-        <w:br/>
-        <w:t>термопанели для фасада купить</w:t>
-        <w:br/>
-        <w:t>термопанели с утеплителем купить</w:t>
-        <w:br/>
-        <w:t>термопанели от производителя</w:t>
-        <w:br/>
-        <w:t>сколько стоит обшить дом термопанелями</w:t>
-        <w:br/>
-        <w:t>расчёт термопанелей на дом</w:t>
-        <w:br/>
-        <w:t>обшить дом термопанелями цена</w:t>
+        <w:t>Автотаргетинг в группе — выкл.</w:t>
       </w:r>
     </w:p>
     <w:p>
@@ -1831,22 +1332,9 @@
         <w:rPr>
           <w:rFonts w:ascii="Times New Roman" w:hAnsi="Times New Roman" w:eastAsia="Times New Roman"/>
           <w:b w:val="0"/>
-          <w:sz w:val="20"/>
-        </w:rPr>
-        <w:t>Смысл: Выборг и Выборгский район. Сейчас ключей нет — это главная дыра. Единственная конверсия недели (14.08, муж. 45–54, смартфон) пришла из этой группы, но с автотаргетинга РСЯ.</w:t>
-      </w:r>
-    </w:p>
-    <w:p>
-      <w:pPr>
-        <w:spacing w:after="40" w:before="0" w:line="269" w:lineRule="auto"/>
-      </w:pPr>
-      <w:r>
-        <w:rPr>
-          <w:rFonts w:ascii="Times New Roman" w:hAnsi="Times New Roman" w:eastAsia="Times New Roman"/>
-          <w:b/>
           <w:sz w:val="22"/>
         </w:rPr>
-        <w:t>Сейчас в группе</w:t>
+        <w:t>Ключи добавлены 17.08 (раньше фраз не было). Выборг и Выборгский район. Приозерск сюда не класть.</w:t>
       </w:r>
     </w:p>
     <w:p>
@@ -1858,111 +1346,9 @@
         <w:rPr>
           <w:rFonts w:ascii="Times New Roman" w:hAnsi="Times New Roman" w:eastAsia="Times New Roman"/>
           <w:b w:val="0"/>
-          <w:sz w:val="20"/>
-        </w:rPr>
-        <w:t>автотаргетинг — 200 показов / 10 кликов / 1 конверсия, фраз 0</w:t>
-      </w:r>
-    </w:p>
-    <w:p>
-      <w:pPr>
-        <w:spacing w:after="40" w:before="80" w:line="269" w:lineRule="auto"/>
-      </w:pPr>
-      <w:r>
-        <w:rPr>
-          <w:rFonts w:ascii="Times New Roman" w:hAnsi="Times New Roman" w:eastAsia="Times New Roman"/>
-          <w:b/>
           <w:sz w:val="22"/>
         </w:rPr>
-        <w:t>УДАЛИТЬ</w:t>
-      </w:r>
-    </w:p>
-    <w:p>
-      <w:pPr>
-        <w:pStyle w:val="ListBullet"/>
-        <w:spacing w:after="40" w:line="259" w:lineRule="auto"/>
-      </w:pPr>
-      <w:r>
-        <w:rPr>
-          <w:rFonts w:ascii="Times New Roman" w:hAnsi="Times New Roman" w:eastAsia="Times New Roman"/>
-          <w:b w:val="0"/>
-          <w:sz w:val="20"/>
-        </w:rPr>
-        <w:t>Ничего. Ключей почти нет — только добрать.</w:t>
-      </w:r>
-    </w:p>
-    <w:p>
-      <w:pPr>
-        <w:spacing w:after="60" w:before="80" w:line="269" w:lineRule="auto"/>
-      </w:pPr>
-      <w:r>
-        <w:rPr>
-          <w:rFonts w:ascii="Times New Roman" w:hAnsi="Times New Roman" w:eastAsia="Times New Roman"/>
-          <w:b/>
-          <w:sz w:val="22"/>
-        </w:rPr>
-        <w:t>ДОБАВИТЬ — вставить списком, тип соответствия «фраза»</w:t>
-      </w:r>
-    </w:p>
-    <w:p>
-      <w:pPr>
-        <w:spacing w:after="160" w:line="276" w:lineRule="auto"/>
-        <w:ind w:left="170"/>
-        <w:shd w:fill="F4F7FB" w:val="clear"/>
-      </w:pPr>
-      <w:r>
-        <w:rPr>
-          <w:rFonts w:ascii="Times New Roman" w:hAnsi="Times New Roman" w:eastAsia="Times New Roman"/>
-          <w:b w:val="0"/>
-          <w:sz w:val="20"/>
-        </w:rPr>
-        <w:t>термопанели выборг</w:t>
-        <w:br/>
-        <w:t>купить термопанели выборг</w:t>
-        <w:br/>
-        <w:t>термопанели в выборге</w:t>
-        <w:br/>
-        <w:t>термопанели выборг цена</w:t>
-        <w:br/>
-        <w:t>клинкерные термопанели выборг</w:t>
-        <w:br/>
-        <w:t>фасадные термопанели выборг</w:t>
-        <w:br/>
-        <w:t>термопанели с клинкерной плиткой выборг</w:t>
-        <w:br/>
-        <w:t>производство термопанелей выборг</w:t>
-        <w:br/>
-        <w:t>клинкерпрофи выборг</w:t>
-        <w:br/>
-        <w:t>утепление фасада термопанелями выборг</w:t>
-        <w:br/>
-        <w:t>доставка термопанелей выборг</w:t>
-        <w:br/>
-        <w:t>термопанели выборгский район</w:t>
-        <w:br/>
-        <w:t>термопанели советский</w:t>
-        <w:br/>
-        <w:t>термопанели приморск</w:t>
-        <w:br/>
-        <w:t>термопанели рощино</w:t>
-        <w:br/>
-        <w:t>термопанели высоцк</w:t>
-        <w:br/>
-        <w:t>термопанели каменногорск</w:t>
-        <w:br/>
-        <w:t>термопанели светогорск</w:t>
-      </w:r>
-    </w:p>
-    <w:p>
-      <w:pPr>
-        <w:spacing w:after="160" w:before="0" w:line="269" w:lineRule="auto"/>
-      </w:pPr>
-      <w:r>
-        <w:rPr>
-          <w:rFonts w:ascii="Times New Roman" w:hAnsi="Times New Roman" w:eastAsia="Times New Roman"/>
-          <w:b w:val="0"/>
-          <w:sz w:val="20"/>
-        </w:rPr>
-        <w:t>Регион показа группы — Выборг + Выборгский район, не вся РФ. Приозерск сюда не класть (другая РК).</w:t>
+        <w:t>Автотаргетинг выкл. — иначе не видно, работают ли «термопанели выборг».</w:t>
       </w:r>
     </w:p>
     <w:p>
@@ -1986,22 +1372,9 @@
         <w:rPr>
           <w:rFonts w:ascii="Times New Roman" w:hAnsi="Times New Roman" w:eastAsia="Times New Roman"/>
           <w:b w:val="0"/>
-          <w:sz w:val="20"/>
-        </w:rPr>
-        <w:t>Смысл: вид панели, коллекции, «под кирпич». Без городов и без голого «купить термопанели».</w:t>
-      </w:r>
-    </w:p>
-    <w:p>
-      <w:pPr>
-        <w:spacing w:after="40" w:before="0" w:line="269" w:lineRule="auto"/>
-      </w:pPr>
-      <w:r>
-        <w:rPr>
-          <w:rFonts w:ascii="Times New Roman" w:hAnsi="Times New Roman" w:eastAsia="Times New Roman"/>
-          <w:b/>
           <w:sz w:val="22"/>
         </w:rPr>
-        <w:t>Сейчас в группе</w:t>
+        <w:t>Ключи добавлены 17.08. Вид панели / коллекции, без городов.</w:t>
       </w:r>
     </w:p>
     <w:p>
@@ -2013,138 +1386,9 @@
         <w:rPr>
           <w:rFonts w:ascii="Times New Roman" w:hAnsi="Times New Roman" w:eastAsia="Times New Roman"/>
           <w:b w:val="0"/>
-          <w:sz w:val="20"/>
-        </w:rPr>
-        <w:t>термопанели с клинкерной плиткой купить — 1 показ, оставить</w:t>
-      </w:r>
-    </w:p>
-    <w:p>
-      <w:pPr>
-        <w:pStyle w:val="ListBullet"/>
-        <w:spacing w:after="40" w:line="259" w:lineRule="auto"/>
-      </w:pPr>
-      <w:r>
-        <w:rPr>
-          <w:rFonts w:ascii="Times New Roman" w:hAnsi="Times New Roman" w:eastAsia="Times New Roman"/>
-          <w:b w:val="0"/>
-          <w:sz w:val="20"/>
-        </w:rPr>
-        <w:t>автотаргетинг — 257 показов / 5 кликов</w:t>
-      </w:r>
-    </w:p>
-    <w:p>
-      <w:pPr>
-        <w:spacing w:after="40" w:before="80" w:line="269" w:lineRule="auto"/>
-      </w:pPr>
-      <w:r>
-        <w:rPr>
-          <w:rFonts w:ascii="Times New Roman" w:hAnsi="Times New Roman" w:eastAsia="Times New Roman"/>
-          <w:b/>
           <w:sz w:val="22"/>
         </w:rPr>
-        <w:t>УДАЛИТЬ</w:t>
-      </w:r>
-    </w:p>
-    <w:p>
-      <w:pPr>
-        <w:pStyle w:val="ListBullet"/>
-        <w:spacing w:after="40" w:line="259" w:lineRule="auto"/>
-      </w:pPr>
-      <w:r>
-        <w:rPr>
-          <w:rFonts w:ascii="Times New Roman" w:hAnsi="Times New Roman" w:eastAsia="Times New Roman"/>
-          <w:b w:val="0"/>
-          <w:sz w:val="20"/>
-        </w:rPr>
-        <w:t>Ничего. Ключей почти нет — только добрать.</w:t>
-      </w:r>
-    </w:p>
-    <w:p>
-      <w:pPr>
-        <w:spacing w:after="40" w:before="80" w:line="269" w:lineRule="auto"/>
-      </w:pPr>
-      <w:r>
-        <w:rPr>
-          <w:rFonts w:ascii="Times New Roman" w:hAnsi="Times New Roman" w:eastAsia="Times New Roman"/>
-          <w:b/>
-          <w:sz w:val="22"/>
-        </w:rPr>
-        <w:t>ОСТАВИТЬ</w:t>
-      </w:r>
-    </w:p>
-    <w:p>
-      <w:pPr>
-        <w:pStyle w:val="ListBullet"/>
-        <w:spacing w:after="40" w:line="259" w:lineRule="auto"/>
-      </w:pPr>
-      <w:r>
-        <w:rPr>
-          <w:rFonts w:ascii="Times New Roman" w:hAnsi="Times New Roman" w:eastAsia="Times New Roman"/>
-          <w:b w:val="0"/>
-          <w:sz w:val="20"/>
-        </w:rPr>
-        <w:t>термопанели с клинкерной плиткой купить</w:t>
-      </w:r>
-    </w:p>
-    <w:p>
-      <w:pPr>
-        <w:spacing w:after="60" w:before="80" w:line="269" w:lineRule="auto"/>
-      </w:pPr>
-      <w:r>
-        <w:rPr>
-          <w:rFonts w:ascii="Times New Roman" w:hAnsi="Times New Roman" w:eastAsia="Times New Roman"/>
-          <w:b/>
-          <w:sz w:val="22"/>
-        </w:rPr>
-        <w:t>ДОБАВИТЬ — вставить списком, тип соответствия «фраза»</w:t>
-      </w:r>
-    </w:p>
-    <w:p>
-      <w:pPr>
-        <w:spacing w:after="160" w:line="276" w:lineRule="auto"/>
-        <w:ind w:left="170"/>
-        <w:shd w:fill="F4F7FB" w:val="clear"/>
-      </w:pPr>
-      <w:r>
-        <w:rPr>
-          <w:rFonts w:ascii="Times New Roman" w:hAnsi="Times New Roman" w:eastAsia="Times New Roman"/>
-          <w:b w:val="0"/>
-          <w:sz w:val="20"/>
-        </w:rPr>
-        <w:t>клинкерные термопанели</w:t>
-        <w:br/>
-        <w:t>термопанели с клинкерной плиткой</w:t>
-        <w:br/>
-        <w:t>клинкерные панели для фасада</w:t>
-        <w:br/>
-        <w:t>панели с клинкерной плиткой для фасада</w:t>
-        <w:br/>
-        <w:t>термопанели под кирпич</w:t>
-        <w:br/>
-        <w:t>фасадные термопанели под кирпич</w:t>
-        <w:br/>
-        <w:t>термопанели колорадо</w:t>
-        <w:br/>
-        <w:t>термопанели амстердам</w:t>
-        <w:br/>
-        <w:t>фасадные термопанели с утеплителем</w:t>
-        <w:br/>
-        <w:t>термопанели пенополистирол клинкер</w:t>
-        <w:br/>
-        <w:t>термопанели с пенополистиролом</w:t>
-      </w:r>
-    </w:p>
-    <w:p>
-      <w:pPr>
-        <w:spacing w:after="160" w:before="0" w:line="269" w:lineRule="auto"/>
-      </w:pPr>
-      <w:r>
-        <w:rPr>
-          <w:rFonts w:ascii="Times New Roman" w:hAnsi="Times New Roman" w:eastAsia="Times New Roman"/>
-          <w:b w:val="0"/>
-          <w:sz w:val="20"/>
-        </w:rPr>
-        <w:t>На Поиске у группы было 100 показов и 0 кликов — после ключей поправить заголовок: «Клинкерные термопанели, завод в Выборге, от 1 550 ₽».</w:t>
+        <w:t>Заголовок объявлений: «Клинкерные термопанели, завод в Выборге, от 1 550 ₽».</w:t>
       </w:r>
     </w:p>
     <w:p>
@@ -2157,7 +1401,7 @@
           <w:rFonts w:ascii="Times New Roman" w:hAnsi="Times New Roman" w:eastAsia="Times New Roman"/>
           <w:color w:val="1F4E79"/>
         </w:rPr>
-        <w:t>Термопанели (транз)  ·  5772834263</w:t>
+        <w:t>Термопанели (транз)  ·  5772834263 — СТОП</w:t>
       </w:r>
     </w:p>
     <w:p>
@@ -2168,22 +1412,9 @@
         <w:rPr>
           <w:rFonts w:ascii="Times New Roman" w:hAnsi="Times New Roman" w:eastAsia="Times New Roman"/>
           <w:b w:val="0"/>
-          <w:sz w:val="20"/>
-        </w:rPr>
-        <w:t>Смысл: транзакционные запросы из СПб («купить / от производителя / с доставкой»), не Выборг и не Приозерск.</w:t>
-      </w:r>
-    </w:p>
-    <w:p>
-      <w:pPr>
-        <w:spacing w:after="40" w:before="0" w:line="269" w:lineRule="auto"/>
-      </w:pPr>
-      <w:r>
-        <w:rPr>
-          <w:rFonts w:ascii="Times New Roman" w:hAnsi="Times New Roman" w:eastAsia="Times New Roman"/>
-          <w:b/>
           <w:sz w:val="22"/>
         </w:rPr>
-        <w:t>Сейчас в группе</w:t>
+        <w:t>Группа остановлена 17.08. Не включать, ключи в ней не править.</w:t>
       </w:r>
     </w:p>
     <w:p>
@@ -2195,9 +1426,9 @@
         <w:rPr>
           <w:rFonts w:ascii="Times New Roman" w:hAnsi="Times New Roman" w:eastAsia="Times New Roman"/>
           <w:b w:val="0"/>
-          <w:sz w:val="20"/>
+          <w:sz w:val="22"/>
         </w:rPr>
-        <w:t>купить клинкерные термопанели для фасада в спб — оставить</w:t>
+        <w:t>СПб из этой группы больше не идёт — покрытие СПб держит группа ЛО.</w:t>
       </w:r>
     </w:p>
     <w:p>
@@ -2209,186 +1440,9 @@
         <w:rPr>
           <w:rFonts w:ascii="Times New Roman" w:hAnsi="Times New Roman" w:eastAsia="Times New Roman"/>
           <w:b w:val="0"/>
-          <w:sz w:val="20"/>
-        </w:rPr>
-        <w:t>термопанели с клинкерной плиткой купить в спб — оставить здесь, убрать из группы ЛО</w:t>
-      </w:r>
-    </w:p>
-    <w:p>
-      <w:pPr>
-        <w:pStyle w:val="ListBullet"/>
-        <w:spacing w:after="40" w:line="259" w:lineRule="auto"/>
-      </w:pPr>
-      <w:r>
-        <w:rPr>
-          <w:rFonts w:ascii="Times New Roman" w:hAnsi="Times New Roman" w:eastAsia="Times New Roman"/>
-          <w:b w:val="0"/>
-          <w:sz w:val="20"/>
-        </w:rPr>
-        <w:t>фасадные термопанели для наружной отделки дома цена — оставить</w:t>
-      </w:r>
-    </w:p>
-    <w:p>
-      <w:pPr>
-        <w:pStyle w:val="ListBullet"/>
-        <w:spacing w:after="40" w:line="259" w:lineRule="auto"/>
-      </w:pPr>
-      <w:r>
-        <w:rPr>
-          <w:rFonts w:ascii="Times New Roman" w:hAnsi="Times New Roman" w:eastAsia="Times New Roman"/>
-          <w:b w:val="0"/>
-          <w:sz w:val="20"/>
-        </w:rPr>
-        <w:t>фасадные термопанели для наружной отделки дома -цена — удалить (минус «цена»)</w:t>
-      </w:r>
-    </w:p>
-    <w:p>
-      <w:pPr>
-        <w:pStyle w:val="ListBullet"/>
-        <w:spacing w:after="40" w:line="259" w:lineRule="auto"/>
-      </w:pPr>
-      <w:r>
-        <w:rPr>
-          <w:rFonts w:ascii="Times New Roman" w:hAnsi="Times New Roman" w:eastAsia="Times New Roman"/>
-          <w:b w:val="0"/>
-          <w:sz w:val="20"/>
-        </w:rPr>
-        <w:t>автотаргетинг — 447 показов / 8 кликов</w:t>
-      </w:r>
-    </w:p>
-    <w:p>
-      <w:pPr>
-        <w:spacing w:after="40" w:before="80" w:line="269" w:lineRule="auto"/>
-      </w:pPr>
-      <w:r>
-        <w:rPr>
-          <w:rFonts w:ascii="Times New Roman" w:hAnsi="Times New Roman" w:eastAsia="Times New Roman"/>
-          <w:b/>
           <w:sz w:val="22"/>
         </w:rPr>
-        <w:t>УДАЛИТЬ</w:t>
-      </w:r>
-    </w:p>
-    <w:p>
-      <w:pPr>
-        <w:pStyle w:val="ListBullet"/>
-        <w:spacing w:after="40" w:line="259" w:lineRule="auto"/>
-      </w:pPr>
-      <w:r>
-        <w:rPr>
-          <w:rFonts w:ascii="Times New Roman" w:hAnsi="Times New Roman" w:eastAsia="Times New Roman"/>
-          <w:b w:val="0"/>
-          <w:sz w:val="20"/>
-        </w:rPr>
-        <w:t>фасадные термопанели для наружной отделки дома -цена</w:t>
-      </w:r>
-    </w:p>
-    <w:p>
-      <w:pPr>
-        <w:spacing w:after="40" w:before="80" w:line="269" w:lineRule="auto"/>
-      </w:pPr>
-      <w:r>
-        <w:rPr>
-          <w:rFonts w:ascii="Times New Roman" w:hAnsi="Times New Roman" w:eastAsia="Times New Roman"/>
-          <w:b/>
-          <w:sz w:val="22"/>
-        </w:rPr>
-        <w:t>ОСТАВИТЬ</w:t>
-      </w:r>
-    </w:p>
-    <w:p>
-      <w:pPr>
-        <w:pStyle w:val="ListBullet"/>
-        <w:spacing w:after="40" w:line="259" w:lineRule="auto"/>
-      </w:pPr>
-      <w:r>
-        <w:rPr>
-          <w:rFonts w:ascii="Times New Roman" w:hAnsi="Times New Roman" w:eastAsia="Times New Roman"/>
-          <w:b w:val="0"/>
-          <w:sz w:val="20"/>
-        </w:rPr>
-        <w:t>купить клинкерные термопанели для фасада в спб</w:t>
-      </w:r>
-    </w:p>
-    <w:p>
-      <w:pPr>
-        <w:pStyle w:val="ListBullet"/>
-        <w:spacing w:after="40" w:line="259" w:lineRule="auto"/>
-      </w:pPr>
-      <w:r>
-        <w:rPr>
-          <w:rFonts w:ascii="Times New Roman" w:hAnsi="Times New Roman" w:eastAsia="Times New Roman"/>
-          <w:b w:val="0"/>
-          <w:sz w:val="20"/>
-        </w:rPr>
-        <w:t>термопанели с клинкерной плиткой купить в спб</w:t>
-      </w:r>
-    </w:p>
-    <w:p>
-      <w:pPr>
-        <w:pStyle w:val="ListBullet"/>
-        <w:spacing w:after="40" w:line="259" w:lineRule="auto"/>
-      </w:pPr>
-      <w:r>
-        <w:rPr>
-          <w:rFonts w:ascii="Times New Roman" w:hAnsi="Times New Roman" w:eastAsia="Times New Roman"/>
-          <w:b w:val="0"/>
-          <w:sz w:val="20"/>
-        </w:rPr>
-        <w:t>фасадные термопанели для наружной отделки дома цена</w:t>
-      </w:r>
-    </w:p>
-    <w:p>
-      <w:pPr>
-        <w:spacing w:after="60" w:before="80" w:line="269" w:lineRule="auto"/>
-      </w:pPr>
-      <w:r>
-        <w:rPr>
-          <w:rFonts w:ascii="Times New Roman" w:hAnsi="Times New Roman" w:eastAsia="Times New Roman"/>
-          <w:b/>
-          <w:sz w:val="22"/>
-        </w:rPr>
-        <w:t>ДОБАВИТЬ — вставить списком, тип соответствия «фраза»</w:t>
-      </w:r>
-    </w:p>
-    <w:p>
-      <w:pPr>
-        <w:spacing w:after="160" w:line="276" w:lineRule="auto"/>
-        <w:ind w:left="170"/>
-        <w:shd w:fill="F4F7FB" w:val="clear"/>
-      </w:pPr>
-      <w:r>
-        <w:rPr>
-          <w:rFonts w:ascii="Times New Roman" w:hAnsi="Times New Roman" w:eastAsia="Times New Roman"/>
-          <w:b w:val="0"/>
-          <w:sz w:val="20"/>
-        </w:rPr>
-        <w:t>купить термопанели спб</w:t>
-        <w:br/>
-        <w:t>термопанели купить санкт петербург</w:t>
-        <w:br/>
-        <w:t>клинкерные термопанели спб</w:t>
-        <w:br/>
-        <w:t>фасадные термопанели спб</w:t>
-        <w:br/>
-        <w:t>термопанели от производителя спб</w:t>
-        <w:br/>
-        <w:t>термопанели с доставкой спб</w:t>
-        <w:br/>
-        <w:t>производство термопанелей санкт петербург</w:t>
-      </w:r>
-    </w:p>
-    <w:p>
-      <w:pPr>
-        <w:spacing w:after="160" w:before="0" w:line="269" w:lineRule="auto"/>
-      </w:pPr>
-      <w:r>
-        <w:rPr>
-          <w:rFonts w:ascii="Times New Roman" w:hAnsi="Times New Roman" w:eastAsia="Times New Roman"/>
-          <w:b w:val="0"/>
-          <w:sz w:val="20"/>
-        </w:rPr>
-        <w:t>Гео группы — Санкт-Петербург. Не ставить Выборг (группа 2) и не ставить Приозерск.</w:t>
+        <w:t>Снимать с паузы можно только если спб-фразы сначала убрать из ЛО. Иначе две группы бьются за один запрос.</w:t>
       </w:r>
     </w:p>
     <w:p>
@@ -2412,187 +1466,9 @@
         <w:rPr>
           <w:rFonts w:ascii="Times New Roman" w:hAnsi="Times New Roman" w:eastAsia="Times New Roman"/>
           <w:b w:val="0"/>
-          <w:sz w:val="20"/>
-        </w:rPr>
-        <w:t>Смысл: города ЛО кроме Выборгского и Приозерского районов. Сейчас обе фразы про СПб — это не эта группа.</w:t>
-      </w:r>
-    </w:p>
-    <w:p>
-      <w:pPr>
-        <w:spacing w:after="40" w:before="0" w:line="269" w:lineRule="auto"/>
-      </w:pPr>
-      <w:r>
-        <w:rPr>
-          <w:rFonts w:ascii="Times New Roman" w:hAnsi="Times New Roman" w:eastAsia="Times New Roman"/>
-          <w:b/>
           <w:sz w:val="22"/>
         </w:rPr>
-        <w:t>Сейчас в группе</w:t>
-      </w:r>
-    </w:p>
-    <w:p>
-      <w:pPr>
-        <w:pStyle w:val="ListBullet"/>
-        <w:spacing w:after="40" w:line="259" w:lineRule="auto"/>
-      </w:pPr>
-      <w:r>
-        <w:rPr>
-          <w:rFonts w:ascii="Times New Roman" w:hAnsi="Times New Roman" w:eastAsia="Times New Roman"/>
-          <w:b w:val="0"/>
-          <w:sz w:val="20"/>
-        </w:rPr>
-        <w:t>термопанели с клинкерной плиткой купить в спб — дубль транз, удалить отсюда</w:t>
-      </w:r>
-    </w:p>
-    <w:p>
-      <w:pPr>
-        <w:pStyle w:val="ListBullet"/>
-        <w:spacing w:after="40" w:line="259" w:lineRule="auto"/>
-      </w:pPr>
-      <w:r>
-        <w:rPr>
-          <w:rFonts w:ascii="Times New Roman" w:hAnsi="Times New Roman" w:eastAsia="Times New Roman"/>
-          <w:b w:val="0"/>
-          <w:sz w:val="20"/>
-        </w:rPr>
-        <w:t>термопанель купить санкт петербург -фасадный — минус «фасадный» вредный, СПб не сюда</w:t>
-      </w:r>
-    </w:p>
-    <w:p>
-      <w:pPr>
-        <w:pStyle w:val="ListBullet"/>
-        <w:spacing w:after="40" w:line="259" w:lineRule="auto"/>
-      </w:pPr>
-      <w:r>
-        <w:rPr>
-          <w:rFonts w:ascii="Times New Roman" w:hAnsi="Times New Roman" w:eastAsia="Times New Roman"/>
-          <w:b w:val="0"/>
-          <w:sz w:val="20"/>
-        </w:rPr>
-        <w:t>автотаргетинг — 228 показов / 5 кликов</w:t>
-      </w:r>
-    </w:p>
-    <w:p>
-      <w:pPr>
-        <w:spacing w:after="40" w:before="80" w:line="269" w:lineRule="auto"/>
-      </w:pPr>
-      <w:r>
-        <w:rPr>
-          <w:rFonts w:ascii="Times New Roman" w:hAnsi="Times New Roman" w:eastAsia="Times New Roman"/>
-          <w:b/>
-          <w:sz w:val="22"/>
-        </w:rPr>
-        <w:t>УДАЛИТЬ</w:t>
-      </w:r>
-    </w:p>
-    <w:p>
-      <w:pPr>
-        <w:pStyle w:val="ListBullet"/>
-        <w:spacing w:after="40" w:line="259" w:lineRule="auto"/>
-      </w:pPr>
-      <w:r>
-        <w:rPr>
-          <w:rFonts w:ascii="Times New Roman" w:hAnsi="Times New Roman" w:eastAsia="Times New Roman"/>
-          <w:b w:val="0"/>
-          <w:sz w:val="20"/>
-        </w:rPr>
-        <w:t>термопанели с клинкерной плиткой купить в спб</w:t>
-      </w:r>
-    </w:p>
-    <w:p>
-      <w:pPr>
-        <w:pStyle w:val="ListBullet"/>
-        <w:spacing w:after="40" w:line="259" w:lineRule="auto"/>
-      </w:pPr>
-      <w:r>
-        <w:rPr>
-          <w:rFonts w:ascii="Times New Roman" w:hAnsi="Times New Roman" w:eastAsia="Times New Roman"/>
-          <w:b w:val="0"/>
-          <w:sz w:val="20"/>
-        </w:rPr>
-        <w:t>термопанель купить санкт петербург -фасадный</w:t>
-      </w:r>
-    </w:p>
-    <w:p>
-      <w:pPr>
-        <w:spacing w:after="60" w:before="80" w:line="269" w:lineRule="auto"/>
-      </w:pPr>
-      <w:r>
-        <w:rPr>
-          <w:rFonts w:ascii="Times New Roman" w:hAnsi="Times New Roman" w:eastAsia="Times New Roman"/>
-          <w:b/>
-          <w:sz w:val="22"/>
-        </w:rPr>
-        <w:t>ДОБАВИТЬ — вставить списком, тип соответствия «фраза»</w:t>
-      </w:r>
-    </w:p>
-    <w:p>
-      <w:pPr>
-        <w:spacing w:after="160" w:line="276" w:lineRule="auto"/>
-        <w:ind w:left="170"/>
-        <w:shd w:fill="F4F7FB" w:val="clear"/>
-      </w:pPr>
-      <w:r>
-        <w:rPr>
-          <w:rFonts w:ascii="Times New Roman" w:hAnsi="Times New Roman" w:eastAsia="Times New Roman"/>
-          <w:b w:val="0"/>
-          <w:sz w:val="20"/>
-        </w:rPr>
-        <w:t>термопанели ленинградская область</w:t>
-        <w:br/>
-        <w:t>термопанели ленобласть</w:t>
-        <w:br/>
-        <w:t>доставка термопанелей ленобласть</w:t>
-        <w:br/>
-        <w:t>термопанели всеволожск</w:t>
-        <w:br/>
-        <w:t>термопанели гатчина</w:t>
-        <w:br/>
-        <w:t>термопанели тосно</w:t>
-        <w:br/>
-        <w:t>термопанели сертолово</w:t>
-        <w:br/>
-        <w:t>термопанели кудрово</w:t>
-        <w:br/>
-        <w:t>термопанели мурино</w:t>
-        <w:br/>
-        <w:t>термопанели кириши</w:t>
-        <w:br/>
-        <w:t>термопанели тихвин</w:t>
-        <w:br/>
-        <w:t>термопанели кировск</w:t>
-        <w:br/>
-        <w:t>термопанели волхов</w:t>
-        <w:br/>
-        <w:t>термопанели коммунар</w:t>
-        <w:br/>
-        <w:t>термопанели сосновый бор</w:t>
-      </w:r>
-    </w:p>
-    <w:p>
-      <w:pPr>
-        <w:spacing w:after="160" w:before="0" w:line="269" w:lineRule="auto"/>
-      </w:pPr>
-      <w:r>
-        <w:rPr>
-          <w:rFonts w:ascii="Times New Roman" w:hAnsi="Times New Roman" w:eastAsia="Times New Roman"/>
-          <w:b w:val="0"/>
-          <w:sz w:val="20"/>
-        </w:rPr>
-        <w:t>Не добавлять: выборг, приозерск, сосново, ларионово, лосево, громово — они в гео-группе или в РК Приозерска.</w:t>
-      </w:r>
-    </w:p>
-    <w:p>
-      <w:pPr>
-        <w:pStyle w:val="Heading1"/>
-        <w:spacing w:before="200" w:after="80"/>
-      </w:pPr>
-      <w:r>
-        <w:rPr>
-          <w:rFonts w:ascii="Times New Roman" w:hAnsi="Times New Roman" w:eastAsia="Times New Roman"/>
-          <w:color w:val="1F4E79"/>
-        </w:rPr>
-        <w:t>3. Как вставлять в Директе</w:t>
+        <w:t>Ключи добавлены. Фразы по СПб оставлены — это правильное решение при остановленном транзе. Не удалять спб-фразы из этой группы.</w:t>
       </w:r>
     </w:p>
     <w:p>
@@ -2606,7 +1482,7 @@
           <w:b w:val="0"/>
           <w:sz w:val="22"/>
         </w:rPr>
-        <w:t>Группа → Ключевые фразы → Добавить. Вставить блок целиком. Тип: фраза.</w:t>
+        <w:t>СПб: «термопанели с клинкерной плиткой купить в спб», «термопанель купить санкт петербург» и остальные спб-фразы — оставить.</w:t>
       </w:r>
     </w:p>
     <w:p>
@@ -2620,7 +1496,7 @@
           <w:b w:val="0"/>
           <w:sz w:val="22"/>
         </w:rPr>
-        <w:t>Автотаргетинг в этой группе — выкл.</w:t>
+        <w:t>Плюс города ЛО (Всеволожск, Гатчина, Тосно и др.) — уже добавлены, не дублировать.</w:t>
       </w:r>
     </w:p>
     <w:p>
@@ -2634,7 +1510,20 @@
           <w:b w:val="0"/>
           <w:sz w:val="22"/>
         </w:rPr>
-        <w:t>Минус-слова группы не копировать: они уже на кампании.</w:t>
+        <w:t>Не добавлять сюда: выборг (группа 2), приозерск / сосново / ларионово (другая РК).</w:t>
+      </w:r>
+    </w:p>
+    <w:p>
+      <w:pPr>
+        <w:pStyle w:val="Heading1"/>
+        <w:spacing w:before="200" w:after="80"/>
+      </w:pPr>
+      <w:r>
+        <w:rPr>
+          <w:rFonts w:ascii="Times New Roman" w:hAnsi="Times New Roman" w:eastAsia="Times New Roman"/>
+          <w:color w:val="1F4E79"/>
+        </w:rPr>
+        <w:t>3. Что делать дальше (7 дней)</w:t>
       </w:r>
     </w:p>
     <w:p>
@@ -2648,7 +1537,77 @@
           <w:b w:val="0"/>
           <w:sz w:val="22"/>
         </w:rPr>
-        <w:t>После добавления ключей стратегию и CPA не менять 7 дней.</w:t>
+        <w:t>Стратегию, CPA 400/350 и бюджет 9 000 ₽ не менять.</w:t>
+      </w:r>
+    </w:p>
+    <w:p>
+      <w:pPr>
+        <w:pStyle w:val="ListBullet"/>
+        <w:spacing w:after="40" w:line="259" w:lineRule="auto"/>
+      </w:pPr>
+      <w:r>
+        <w:rPr>
+          <w:rFonts w:ascii="Times New Roman" w:hAnsi="Times New Roman" w:eastAsia="Times New Roman"/>
+          <w:b w:val="0"/>
+          <w:sz w:val="22"/>
+        </w:rPr>
+        <w:t>Ключи ещё раз не добавлять.</w:t>
+      </w:r>
+    </w:p>
+    <w:p>
+      <w:pPr>
+        <w:pStyle w:val="ListBullet"/>
+        <w:spacing w:after="40" w:line="259" w:lineRule="auto"/>
+      </w:pPr>
+      <w:r>
+        <w:rPr>
+          <w:rFonts w:ascii="Times New Roman" w:hAnsi="Times New Roman" w:eastAsia="Times New Roman"/>
+          <w:b w:val="0"/>
+          <w:sz w:val="22"/>
+        </w:rPr>
+        <w:t>Транз не включать.</w:t>
+      </w:r>
+    </w:p>
+    <w:p>
+      <w:pPr>
+        <w:pStyle w:val="ListBullet"/>
+        <w:spacing w:after="40" w:line="259" w:lineRule="auto"/>
+      </w:pPr>
+      <w:r>
+        <w:rPr>
+          <w:rFonts w:ascii="Times New Roman" w:hAnsi="Times New Roman" w:eastAsia="Times New Roman"/>
+          <w:b w:val="0"/>
+          <w:sz w:val="22"/>
+        </w:rPr>
+        <w:t>СПб-фразы из ЛО не удалять.</w:t>
+      </w:r>
+    </w:p>
+    <w:p>
+      <w:pPr>
+        <w:pStyle w:val="ListBullet"/>
+        <w:spacing w:after="40" w:line="259" w:lineRule="auto"/>
+      </w:pPr>
+      <w:r>
+        <w:rPr>
+          <w:rFonts w:ascii="Times New Roman" w:hAnsi="Times New Roman" w:eastAsia="Times New Roman"/>
+          <w:b w:val="0"/>
+          <w:sz w:val="22"/>
+        </w:rPr>
+        <w:t>Смотреть показы по новым фразам, не по автотаргетингу. Если «термопанели выборг» без показов — выключить автотаргетинг в гео-группе.</w:t>
+      </w:r>
+    </w:p>
+    <w:p>
+      <w:pPr>
+        <w:pStyle w:val="ListBullet"/>
+        <w:spacing w:after="40" w:line="259" w:lineRule="auto"/>
+      </w:pPr>
+      <w:r>
+        <w:rPr>
+          <w:rFonts w:ascii="Times New Roman" w:hAnsi="Times New Roman" w:eastAsia="Times New Roman"/>
+          <w:b w:val="0"/>
+          <w:sz w:val="22"/>
+        </w:rPr>
+        <w:t>В объявлениях группы ЛО: «СПб и Ленобласть», не только «по области».</w:t>
       </w:r>
     </w:p>
     <w:p>
@@ -2661,7 +1620,7 @@
           <w:b w:val="0"/>
           <w:sz w:val="18"/>
         </w:rPr>
-        <w:t>Источник групп: выгрузка 10–16.08.2026, кампания 712773255. Минус-слова и чистка РСЯ в этом листе не повторяются — сделано.</w:t>
+        <w:t>Факт 17.08.2026: транз на паузе, ключи добавлены, спб-фразы в ЛО оставлены. Минус-слова и чистка РСЯ сделаны ранее.</w:t>
       </w:r>
     </w:p>
     <w:sectPr>
@@ -2690,7 +1649,7 @@
         <w:color w:val="595959"/>
         <w:sz w:val="18"/>
       </w:rPr>
-      <w:t xml:space="preserve">Стратегия + ключи групп «Термопанели в Выборге»  ·  стр. </w:t>
+      <w:t xml:space="preserve">Выборг РК, факт 17.08  ·  стр. </w:t>
     </w:r>
     <w:r>
       <w:rPr>

</xml_diff>